<commit_message>
Add course submissions: FA2 proposal, SA3 capstone paper with data appendix, SA3 deck (house style, PDFs)
Co-Authored-By: Claude Opus 5.5 <noreply@anthropic.com>
Claude-Session: https://claude.ai/code/session_01BJh4xwEjPS1QoGpFfUAH88
</commit_message>
<xml_diff>
--- a/docs/capstone_proposal_FA2.docx
+++ b/docs/capstone_proposal_FA2.docx
@@ -42,7 +42,7 @@
           <w:sz w:val="22"/>
           <w:szCs w:val="22"/>
         </w:rPr>
-        <w:t xml:space="preserve">Group members: [Name 1], [Name 2], [Name 3]</w:t>
+        <w:t xml:space="preserve">Group members: Lian Cataytay, [Name 2], [Name 3]</w:t>
       </w:r>
     </w:p>
     <w:p>
@@ -74,6 +74,7 @@
     <w:p>
       <w:pPr>
         <w:pStyle w:val="Heading1"/>
+        <w:keepNext/>
       </w:pPr>
       <w:r>
         <w:t xml:space="preserve">1. Motivation and Philippine Policy Relevance</w:t>
@@ -178,6 +179,7 @@
     <w:p>
       <w:pPr>
         <w:pStyle w:val="Heading1"/>
+        <w:keepNext/>
       </w:pPr>
       <w:r>
         <w:t xml:space="preserve">2. Research Questions</w:t>
@@ -289,6 +291,7 @@
     <w:p>
       <w:pPr>
         <w:pStyle w:val="Heading1"/>
+        <w:keepNext/>
       </w:pPr>
       <w:r>
         <w:t xml:space="preserve">3. Key Terms and Notation</w:t>
@@ -1551,6 +1554,7 @@
     <w:p>
       <w:pPr>
         <w:pStyle w:val="Heading1"/>
+        <w:keepNext/>
       </w:pPr>
       <w:r>
         <w:t xml:space="preserve">4. Theoretical Framework</w:t>
@@ -1598,6 +1602,7 @@
     <w:p>
       <w:pPr>
         <w:pStyle w:val="Heading2"/>
+        <w:keepNext/>
       </w:pPr>
       <w:r>
         <w:t xml:space="preserve">4.1 General theory: cost-push pricing and the cost of living</w:t>
@@ -2304,6 +2309,7 @@
     <w:p>
       <w:pPr>
         <w:pStyle w:val="Heading2"/>
+        <w:keepNext/>
       </w:pPr>
       <w:r>
         <w:t xml:space="preserve">4.2 Oil-specific theory: how oil price shocks reach consumer prices</w:t>
@@ -2360,6 +2366,7 @@
     <w:p>
       <w:pPr>
         <w:pStyle w:val="Heading2"/>
+        <w:keepNext/>
       </w:pPr>
       <w:r>
         <w:t xml:space="preserve">4.3 Conceptual framework</w:t>
@@ -2443,6 +2450,7 @@
     <w:p>
       <w:pPr>
         <w:pStyle w:val="Heading1"/>
+        <w:keepNext/>
       </w:pPr>
       <w:r>
         <w:t xml:space="preserve">5. Data Sources and Empirical Strategy</w:t>
@@ -2451,6 +2459,7 @@
     <w:p>
       <w:pPr>
         <w:pStyle w:val="Heading2"/>
+        <w:keepNext/>
       </w:pPr>
       <w:r>
         <w:t xml:space="preserve">5.1 Data</w:t>
@@ -2467,6 +2476,7 @@
     </w:p>
     <w:p>
       <w:pPr>
+        <w:keepNext/>
         <w:spacing w:after="80" w:before="120"/>
       </w:pPr>
       <w:r>
@@ -3619,6 +3629,7 @@
     <w:p>
       <w:pPr>
         <w:pStyle w:val="Heading2"/>
+        <w:keepNext/>
       </w:pPr>
       <w:r>
         <w:t xml:space="preserve">5.2 Empirical model</w:t>
@@ -4330,6 +4341,7 @@
     <w:p>
       <w:pPr>
         <w:pStyle w:val="Heading2"/>
+        <w:keepNext/>
       </w:pPr>
       <w:r>
         <w:t xml:space="preserve">5.3 Validation, robustness and policy analysis</w:t>
@@ -4386,6 +4398,7 @@
     <w:p>
       <w:pPr>
         <w:pStyle w:val="Heading1"/>
+        <w:keepNext/>
       </w:pPr>
       <w:r>
         <w:t xml:space="preserve">6. Workplan and Timeline</w:t>
@@ -4542,6 +4555,7 @@
     <w:p>
       <w:pPr>
         <w:pStyle w:val="Heading1"/>
+        <w:keepNext/>
       </w:pPr>
       <w:r>
         <w:t xml:space="preserve">References</w:t>
@@ -5278,6 +5292,14 @@
       <w:szCs w:val="20"/>
     </w:rPr>
   </w:style>
+  <w:style w:type="paragraph" w:styleId="Normal">
+    <w:name w:val="Normal"/>
+    <w:rPr>
+      <w:rFonts w:ascii="Times New Roman" w:cs="Times New Roman" w:eastAsia="Times New Roman" w:hAnsi="Times New Roman"/>
+      <w:sz w:val="24"/>
+      <w:szCs w:val="24"/>
+    </w:rPr>
+  </w:style>
   <w:style w:type="paragraph" w:styleId="Heading1">
     <w:name w:val="Heading 1"/>
     <w:basedOn w:val="Normal"/>

</xml_diff>

<commit_message>
Submissions: sole author, November 2026, drop AI-use disclosure from generated documents
Co-Authored-By: Claude Opus 5.5 <noreply@anthropic.com>
Claude-Session: https://claude.ai/code/session_01BJh4xwEjPS1QoGpFfUAH88
</commit_message>
<xml_diff>
--- a/docs/capstone_proposal_FA2.docx
+++ b/docs/capstone_proposal_FA2.docx
@@ -42,7 +42,7 @@
           <w:sz w:val="22"/>
           <w:szCs w:val="22"/>
         </w:rPr>
-        <w:t xml:space="preserve">Group members: Lian Cataytay, [Name 2], [Name 3]</w:t>
+        <w:t xml:space="preserve">Lian Cataytay</w:t>
       </w:r>
     </w:p>
     <w:p>
@@ -68,7 +68,7 @@
           <w:sz w:val="22"/>
           <w:szCs w:val="22"/>
         </w:rPr>
-        <w:t xml:space="preserve">Submitted: Week 10, October 2026</w:t>
+        <w:t xml:space="preserve">Submitted: Week 10, November 2026</w:t>
       </w:r>
     </w:p>
     <w:p>

</xml_diff>